<commit_message>
chore: auto-render Quarto site to docs/
</commit_message>
<xml_diff>
--- a/docs/Little-Kids,-Big-Adventures--A-Guide-to-Family-Hikes-Around-Knoxville.docx
+++ b/docs/Little-Kids,-Big-Adventures--A-Guide-to-Family-Hikes-Around-Knoxville.docx
@@ -5617,7 +5617,7 @@
                     <a:graphicData uri="http://schemas.openxmlformats.org/drawingml/2006/picture">
                       <pic:pic>
                         <pic:nvPicPr>
-                          <pic:cNvPr descr="/Applications/Positron.app/Contents/Resources/app/quarto/share/formats/docx/note.png" id="47" name="Picture"/>
+                          <pic:cNvPr descr="/opt/quarto/share/formats/docx/note.png" id="47" name="Picture"/>
                           <pic:cNvPicPr>
                             <a:picLocks noChangeArrowheads="1" noChangeAspect="1"/>
                           </pic:cNvPicPr>
@@ -6432,7 +6432,7 @@
                     <a:graphicData uri="http://schemas.openxmlformats.org/drawingml/2006/picture">
                       <pic:pic>
                         <pic:nvPicPr>
-                          <pic:cNvPr descr="/Applications/Positron.app/Contents/Resources/app/quarto/share/formats/docx/note.png" id="55" name="Picture"/>
+                          <pic:cNvPr descr="/opt/quarto/share/formats/docx/note.png" id="55" name="Picture"/>
                           <pic:cNvPicPr>
                             <a:picLocks noChangeArrowheads="1" noChangeAspect="1"/>
                           </pic:cNvPicPr>
@@ -7269,7 +7269,7 @@
                     <a:graphicData uri="http://schemas.openxmlformats.org/drawingml/2006/picture">
                       <pic:pic>
                         <pic:nvPicPr>
-                          <pic:cNvPr descr="/Applications/Positron.app/Contents/Resources/app/quarto/share/formats/docx/note.png" id="63" name="Picture"/>
+                          <pic:cNvPr descr="/opt/quarto/share/formats/docx/note.png" id="63" name="Picture"/>
                           <pic:cNvPicPr>
                             <a:picLocks noChangeArrowheads="1" noChangeAspect="1"/>
                           </pic:cNvPicPr>
@@ -8655,7 +8655,7 @@
                     <a:graphicData uri="http://schemas.openxmlformats.org/drawingml/2006/picture">
                       <pic:pic>
                         <pic:nvPicPr>
-                          <pic:cNvPr descr="/Applications/Positron.app/Contents/Resources/app/quarto/share/formats/docx/note.png" id="78" name="Picture"/>
+                          <pic:cNvPr descr="/opt/quarto/share/formats/docx/note.png" id="78" name="Picture"/>
                           <pic:cNvPicPr>
                             <a:picLocks noChangeArrowheads="1" noChangeAspect="1"/>
                           </pic:cNvPicPr>
@@ -9469,7 +9469,7 @@
                     <a:graphicData uri="http://schemas.openxmlformats.org/drawingml/2006/picture">
                       <pic:pic>
                         <pic:nvPicPr>
-                          <pic:cNvPr descr="/Applications/Positron.app/Contents/Resources/app/quarto/share/formats/docx/note.png" id="87" name="Picture"/>
+                          <pic:cNvPr descr="/opt/quarto/share/formats/docx/note.png" id="87" name="Picture"/>
                           <pic:cNvPicPr>
                             <a:picLocks noChangeArrowheads="1" noChangeAspect="1"/>
                           </pic:cNvPicPr>
@@ -10287,7 +10287,7 @@
                     <a:graphicData uri="http://schemas.openxmlformats.org/drawingml/2006/picture">
                       <pic:pic>
                         <pic:nvPicPr>
-                          <pic:cNvPr descr="/Applications/Positron.app/Contents/Resources/app/quarto/share/formats/docx/note.png" id="95" name="Picture"/>
+                          <pic:cNvPr descr="/opt/quarto/share/formats/docx/note.png" id="95" name="Picture"/>
                           <pic:cNvPicPr>
                             <a:picLocks noChangeArrowheads="1" noChangeAspect="1"/>
                           </pic:cNvPicPr>
@@ -10404,7 +10404,7 @@
                     <a:graphicData uri="http://schemas.openxmlformats.org/drawingml/2006/picture">
                       <pic:pic>
                         <pic:nvPicPr>
-                          <pic:cNvPr descr="/Applications/Positron.app/Contents/Resources/app/quarto/share/formats/docx/note.png" id="97" name="Picture"/>
+                          <pic:cNvPr descr="/opt/quarto/share/formats/docx/note.png" id="97" name="Picture"/>
                           <pic:cNvPicPr>
                             <a:picLocks noChangeArrowheads="1" noChangeAspect="1"/>
                           </pic:cNvPicPr>
@@ -11140,7 +11140,7 @@
                     <a:graphicData uri="http://schemas.openxmlformats.org/drawingml/2006/picture">
                       <pic:pic>
                         <pic:nvPicPr>
-                          <pic:cNvPr descr="/Applications/Positron.app/Contents/Resources/app/quarto/share/formats/docx/note.png" id="105" name="Picture"/>
+                          <pic:cNvPr descr="/opt/quarto/share/formats/docx/note.png" id="105" name="Picture"/>
                           <pic:cNvPicPr>
                             <a:picLocks noChangeArrowheads="1" noChangeAspect="1"/>
                           </pic:cNvPicPr>
@@ -11873,7 +11873,7 @@
                     <a:graphicData uri="http://schemas.openxmlformats.org/drawingml/2006/picture">
                       <pic:pic>
                         <pic:nvPicPr>
-                          <pic:cNvPr descr="/Applications/Positron.app/Contents/Resources/app/quarto/share/formats/docx/note.png" id="113" name="Picture"/>
+                          <pic:cNvPr descr="/opt/quarto/share/formats/docx/note.png" id="113" name="Picture"/>
                           <pic:cNvPicPr>
                             <a:picLocks noChangeArrowheads="1" noChangeAspect="1"/>
                           </pic:cNvPicPr>
@@ -12712,7 +12712,7 @@
                     <a:graphicData uri="http://schemas.openxmlformats.org/drawingml/2006/picture">
                       <pic:pic>
                         <pic:nvPicPr>
-                          <pic:cNvPr descr="/Applications/Positron.app/Contents/Resources/app/quarto/share/formats/docx/note.png" id="121" name="Picture"/>
+                          <pic:cNvPr descr="/opt/quarto/share/formats/docx/note.png" id="121" name="Picture"/>
                           <pic:cNvPicPr>
                             <a:picLocks noChangeArrowheads="1" noChangeAspect="1"/>
                           </pic:cNvPicPr>
@@ -13467,7 +13467,7 @@
                     <a:graphicData uri="http://schemas.openxmlformats.org/drawingml/2006/picture">
                       <pic:pic>
                         <pic:nvPicPr>
-                          <pic:cNvPr descr="/Applications/Positron.app/Contents/Resources/app/quarto/share/formats/docx/note.png" id="129" name="Picture"/>
+                          <pic:cNvPr descr="/opt/quarto/share/formats/docx/note.png" id="129" name="Picture"/>
                           <pic:cNvPicPr>
                             <a:picLocks noChangeArrowheads="1" noChangeAspect="1"/>
                           </pic:cNvPicPr>
@@ -14255,7 +14255,7 @@
                     <a:graphicData uri="http://schemas.openxmlformats.org/drawingml/2006/picture">
                       <pic:pic>
                         <pic:nvPicPr>
-                          <pic:cNvPr descr="/Applications/Positron.app/Contents/Resources/app/quarto/share/formats/docx/note.png" id="137" name="Picture"/>
+                          <pic:cNvPr descr="/opt/quarto/share/formats/docx/note.png" id="137" name="Picture"/>
                           <pic:cNvPicPr>
                             <a:picLocks noChangeArrowheads="1" noChangeAspect="1"/>
                           </pic:cNvPicPr>
@@ -15552,7 +15552,7 @@
                     <a:graphicData uri="http://schemas.openxmlformats.org/drawingml/2006/picture">
                       <pic:pic>
                         <pic:nvPicPr>
-                          <pic:cNvPr descr="/Applications/Positron.app/Contents/Resources/app/quarto/share/formats/docx/note.png" id="150" name="Picture"/>
+                          <pic:cNvPr descr="/opt/quarto/share/formats/docx/note.png" id="150" name="Picture"/>
                           <pic:cNvPicPr>
                             <a:picLocks noChangeArrowheads="1" noChangeAspect="1"/>
                           </pic:cNvPicPr>
@@ -16381,7 +16381,7 @@
                     <a:graphicData uri="http://schemas.openxmlformats.org/drawingml/2006/picture">
                       <pic:pic>
                         <pic:nvPicPr>
-                          <pic:cNvPr descr="/Applications/Positron.app/Contents/Resources/app/quarto/share/formats/docx/note.png" id="158" name="Picture"/>
+                          <pic:cNvPr descr="/opt/quarto/share/formats/docx/note.png" id="158" name="Picture"/>
                           <pic:cNvPicPr>
                             <a:picLocks noChangeArrowheads="1" noChangeAspect="1"/>
                           </pic:cNvPicPr>
@@ -17703,7 +17703,7 @@
                     <a:graphicData uri="http://schemas.openxmlformats.org/drawingml/2006/picture">
                       <pic:pic>
                         <pic:nvPicPr>
-                          <pic:cNvPr descr="/Applications/Positron.app/Contents/Resources/app/quarto/share/formats/docx/note.png" id="173" name="Picture"/>
+                          <pic:cNvPr descr="/opt/quarto/share/formats/docx/note.png" id="173" name="Picture"/>
                           <pic:cNvPicPr>
                             <a:picLocks noChangeArrowheads="1" noChangeAspect="1"/>
                           </pic:cNvPicPr>
@@ -18497,7 +18497,7 @@
                     <a:graphicData uri="http://schemas.openxmlformats.org/drawingml/2006/picture">
                       <pic:pic>
                         <pic:nvPicPr>
-                          <pic:cNvPr descr="/Applications/Positron.app/Contents/Resources/app/quarto/share/formats/docx/note.png" id="181" name="Picture"/>
+                          <pic:cNvPr descr="/opt/quarto/share/formats/docx/note.png" id="181" name="Picture"/>
                           <pic:cNvPicPr>
                             <a:picLocks noChangeArrowheads="1" noChangeAspect="1"/>
                           </pic:cNvPicPr>
@@ -19224,7 +19224,7 @@
                     <a:graphicData uri="http://schemas.openxmlformats.org/drawingml/2006/picture">
                       <pic:pic>
                         <pic:nvPicPr>
-                          <pic:cNvPr descr="/Applications/Positron.app/Contents/Resources/app/quarto/share/formats/docx/note.png" id="189" name="Picture"/>
+                          <pic:cNvPr descr="/opt/quarto/share/formats/docx/note.png" id="189" name="Picture"/>
                           <pic:cNvPicPr>
                             <a:picLocks noChangeArrowheads="1" noChangeAspect="1"/>
                           </pic:cNvPicPr>
@@ -20230,7 +20230,7 @@
                     <a:graphicData uri="http://schemas.openxmlformats.org/drawingml/2006/picture">
                       <pic:pic>
                         <pic:nvPicPr>
-                          <pic:cNvPr descr="/Applications/Positron.app/Contents/Resources/app/quarto/share/formats/docx/note.png" id="197" name="Picture"/>
+                          <pic:cNvPr descr="/opt/quarto/share/formats/docx/note.png" id="197" name="Picture"/>
                           <pic:cNvPicPr>
                             <a:picLocks noChangeArrowheads="1" noChangeAspect="1"/>
                           </pic:cNvPicPr>
@@ -20447,7 +20447,7 @@
                     <a:graphicData uri="http://schemas.openxmlformats.org/drawingml/2006/picture">
                       <pic:pic>
                         <pic:nvPicPr>
-                          <pic:cNvPr descr="/Applications/Positron.app/Contents/Resources/app/quarto/share/formats/docx/warning.png" id="203" name="Picture"/>
+                          <pic:cNvPr descr="/opt/quarto/share/formats/docx/warning.png" id="203" name="Picture"/>
                           <pic:cNvPicPr>
                             <a:picLocks noChangeArrowheads="1" noChangeAspect="1"/>
                           </pic:cNvPicPr>
@@ -21121,7 +21121,7 @@
                     <a:graphicData uri="http://schemas.openxmlformats.org/drawingml/2006/picture">
                       <pic:pic>
                         <pic:nvPicPr>
-                          <pic:cNvPr descr="/Applications/Positron.app/Contents/Resources/app/quarto/share/formats/docx/note.png" id="211" name="Picture"/>
+                          <pic:cNvPr descr="/opt/quarto/share/formats/docx/note.png" id="211" name="Picture"/>
                           <pic:cNvPicPr>
                             <a:picLocks noChangeArrowheads="1" noChangeAspect="1"/>
                           </pic:cNvPicPr>
@@ -21992,7 +21992,7 @@
                     <a:graphicData uri="http://schemas.openxmlformats.org/drawingml/2006/picture">
                       <pic:pic>
                         <pic:nvPicPr>
-                          <pic:cNvPr descr="/Applications/Positron.app/Contents/Resources/app/quarto/share/formats/docx/note.png" id="219" name="Picture"/>
+                          <pic:cNvPr descr="/opt/quarto/share/formats/docx/note.png" id="219" name="Picture"/>
                           <pic:cNvPicPr>
                             <a:picLocks noChangeArrowheads="1" noChangeAspect="1"/>
                           </pic:cNvPicPr>
@@ -22718,7 +22718,7 @@
                     <a:graphicData uri="http://schemas.openxmlformats.org/drawingml/2006/picture">
                       <pic:pic>
                         <pic:nvPicPr>
-                          <pic:cNvPr descr="/Applications/Positron.app/Contents/Resources/app/quarto/share/formats/docx/note.png" id="227" name="Picture"/>
+                          <pic:cNvPr descr="/opt/quarto/share/formats/docx/note.png" id="227" name="Picture"/>
                           <pic:cNvPicPr>
                             <a:picLocks noChangeArrowheads="1" noChangeAspect="1"/>
                           </pic:cNvPicPr>
@@ -23507,7 +23507,7 @@
                     <a:graphicData uri="http://schemas.openxmlformats.org/drawingml/2006/picture">
                       <pic:pic>
                         <pic:nvPicPr>
-                          <pic:cNvPr descr="/Applications/Positron.app/Contents/Resources/app/quarto/share/formats/docx/note.png" id="235" name="Picture"/>
+                          <pic:cNvPr descr="/opt/quarto/share/formats/docx/note.png" id="235" name="Picture"/>
                           <pic:cNvPicPr>
                             <a:picLocks noChangeArrowheads="1" noChangeAspect="1"/>
                           </pic:cNvPicPr>
@@ -24371,7 +24371,7 @@
                     <a:graphicData uri="http://schemas.openxmlformats.org/drawingml/2006/picture">
                       <pic:pic>
                         <pic:nvPicPr>
-                          <pic:cNvPr descr="/Applications/Positron.app/Contents/Resources/app/quarto/share/formats/docx/note.png" id="243" name="Picture"/>
+                          <pic:cNvPr descr="/opt/quarto/share/formats/docx/note.png" id="243" name="Picture"/>
                           <pic:cNvPicPr>
                             <a:picLocks noChangeArrowheads="1" noChangeAspect="1"/>
                           </pic:cNvPicPr>
@@ -24488,7 +24488,7 @@
                     <a:graphicData uri="http://schemas.openxmlformats.org/drawingml/2006/picture">
                       <pic:pic>
                         <pic:nvPicPr>
-                          <pic:cNvPr descr="/Applications/Positron.app/Contents/Resources/app/quarto/share/formats/docx/note.png" id="245" name="Picture"/>
+                          <pic:cNvPr descr="/opt/quarto/share/formats/docx/note.png" id="245" name="Picture"/>
                           <pic:cNvPicPr>
                             <a:picLocks noChangeArrowheads="1" noChangeAspect="1"/>
                           </pic:cNvPicPr>
@@ -25251,7 +25251,7 @@
                     <a:graphicData uri="http://schemas.openxmlformats.org/drawingml/2006/picture">
                       <pic:pic>
                         <pic:nvPicPr>
-                          <pic:cNvPr descr="/Applications/Positron.app/Contents/Resources/app/quarto/share/formats/docx/note.png" id="253" name="Picture"/>
+                          <pic:cNvPr descr="/opt/quarto/share/formats/docx/note.png" id="253" name="Picture"/>
                           <pic:cNvPicPr>
                             <a:picLocks noChangeArrowheads="1" noChangeAspect="1"/>
                           </pic:cNvPicPr>
@@ -25949,7 +25949,7 @@
                     <a:graphicData uri="http://schemas.openxmlformats.org/drawingml/2006/picture">
                       <pic:pic>
                         <pic:nvPicPr>
-                          <pic:cNvPr descr="/Applications/Positron.app/Contents/Resources/app/quarto/share/formats/docx/note.png" id="261" name="Picture"/>
+                          <pic:cNvPr descr="/opt/quarto/share/formats/docx/note.png" id="261" name="Picture"/>
                           <pic:cNvPicPr>
                             <a:picLocks noChangeArrowheads="1" noChangeAspect="1"/>
                           </pic:cNvPicPr>
@@ -26673,7 +26673,7 @@
                     <a:graphicData uri="http://schemas.openxmlformats.org/drawingml/2006/picture">
                       <pic:pic>
                         <pic:nvPicPr>
-                          <pic:cNvPr descr="/Applications/Positron.app/Contents/Resources/app/quarto/share/formats/docx/note.png" id="269" name="Picture"/>
+                          <pic:cNvPr descr="/opt/quarto/share/formats/docx/note.png" id="269" name="Picture"/>
                           <pic:cNvPicPr>
                             <a:picLocks noChangeArrowheads="1" noChangeAspect="1"/>
                           </pic:cNvPicPr>
@@ -27521,7 +27521,7 @@
                     <a:graphicData uri="http://schemas.openxmlformats.org/drawingml/2006/picture">
                       <pic:pic>
                         <pic:nvPicPr>
-                          <pic:cNvPr descr="/Applications/Positron.app/Contents/Resources/app/quarto/share/formats/docx/note.png" id="277" name="Picture"/>
+                          <pic:cNvPr descr="/opt/quarto/share/formats/docx/note.png" id="277" name="Picture"/>
                           <pic:cNvPicPr>
                             <a:picLocks noChangeArrowheads="1" noChangeAspect="1"/>
                           </pic:cNvPicPr>
@@ -28414,7 +28414,7 @@
                     <a:graphicData uri="http://schemas.openxmlformats.org/drawingml/2006/picture">
                       <pic:pic>
                         <pic:nvPicPr>
-                          <pic:cNvPr descr="/Applications/Positron.app/Contents/Resources/app/quarto/share/formats/docx/note.png" id="285" name="Picture"/>
+                          <pic:cNvPr descr="/opt/quarto/share/formats/docx/note.png" id="285" name="Picture"/>
                           <pic:cNvPicPr>
                             <a:picLocks noChangeArrowheads="1" noChangeAspect="1"/>
                           </pic:cNvPicPr>
@@ -28531,7 +28531,7 @@
                     <a:graphicData uri="http://schemas.openxmlformats.org/drawingml/2006/picture">
                       <pic:pic>
                         <pic:nvPicPr>
-                          <pic:cNvPr descr="/Applications/Positron.app/Contents/Resources/app/quarto/share/formats/docx/note.png" id="287" name="Picture"/>
+                          <pic:cNvPr descr="/opt/quarto/share/formats/docx/note.png" id="287" name="Picture"/>
                           <pic:cNvPicPr>
                             <a:picLocks noChangeArrowheads="1" noChangeAspect="1"/>
                           </pic:cNvPicPr>

</xml_diff>